<commit_message>
redact queue cotext menu
</commit_message>
<xml_diff>
--- a/Руководство_пользователя.docx
+++ b/Руководство_пользователя.docx
@@ -674,18 +674,25 @@
       <w:pPr>
         <w:pStyle w:val="a3"/>
         <w:ind w:left="360" w:firstLine="348"/>
-        <w:jc w:val="both"/>
-        <w:rPr>
-          <w:sz w:val="28"/>
-          <w:szCs w:val="28"/>
-        </w:rPr>
-      </w:pPr>
-      <w:r>
-        <w:rPr>
-          <w:sz w:val="28"/>
-          <w:szCs w:val="28"/>
-        </w:rPr>
-        <w:t>Вот перечень ролей в системе, с их кратким описанием:</w:t>
+        <w:jc w:val="center"/>
+        <w:rPr>
+          <w:sz w:val="28"/>
+          <w:szCs w:val="28"/>
+        </w:rPr>
+      </w:pPr>
+      <w:r>
+        <w:rPr>
+          <w:sz w:val="28"/>
+          <w:szCs w:val="28"/>
+        </w:rPr>
+        <w:t>П</w:t>
+      </w:r>
+      <w:r>
+        <w:rPr>
+          <w:sz w:val="28"/>
+          <w:szCs w:val="28"/>
+        </w:rPr>
+        <w:t>еречень ролей в системе, с их кратким описанием:</w:t>
       </w:r>
     </w:p>
     <w:p>
@@ -988,12 +995,16 @@
         <w:spacing w:line="240" w:lineRule="auto"/>
         <w:jc w:val="both"/>
         <w:rPr>
-          <w:sz w:val="28"/>
-          <w:szCs w:val="28"/>
-        </w:rPr>
-      </w:pPr>
-      <w:r>
-        <w:rPr>
+          <w:b/>
+          <w:bCs/>
+          <w:sz w:val="28"/>
+          <w:szCs w:val="28"/>
+        </w:rPr>
+      </w:pPr>
+      <w:r>
+        <w:rPr>
+          <w:b/>
+          <w:bCs/>
           <w:sz w:val="28"/>
           <w:szCs w:val="28"/>
         </w:rPr>
@@ -1378,16 +1389,16 @@
         </w:rPr>
         <w:lastRenderedPageBreak/>
         <w:drawing>
-          <wp:anchor distT="0" distB="0" distL="114300" distR="114300" simplePos="0" relativeHeight="251658240" behindDoc="0" locked="0" layoutInCell="1" allowOverlap="1" wp14:anchorId="3EA675D2" wp14:editId="1302DE25">
+          <wp:anchor distT="0" distB="0" distL="114300" distR="114300" simplePos="0" relativeHeight="251656192" behindDoc="0" locked="0" layoutInCell="1" allowOverlap="1" wp14:anchorId="3EA675D2" wp14:editId="436FB6B8">
             <wp:simplePos x="0" y="0"/>
             <wp:positionH relativeFrom="column">
-              <wp:posOffset>-573405</wp:posOffset>
+              <wp:posOffset>-575310</wp:posOffset>
             </wp:positionH>
             <wp:positionV relativeFrom="paragraph">
-              <wp:posOffset>-2540</wp:posOffset>
+              <wp:posOffset>-5715</wp:posOffset>
             </wp:positionV>
-            <wp:extent cx="6695440" cy="2708910"/>
-            <wp:effectExtent l="19050" t="0" r="0" b="0"/>
+            <wp:extent cx="6200775" cy="2508250"/>
+            <wp:effectExtent l="0" t="0" r="0" b="0"/>
             <wp:wrapTopAndBottom/>
             <wp:docPr id="8" name="Рисунок 8"/>
             <wp:cNvGraphicFramePr>
@@ -1412,7 +1423,7 @@
                   <pic:spPr bwMode="auto">
                     <a:xfrm>
                       <a:off x="0" y="0"/>
-                      <a:ext cx="6695440" cy="2708910"/>
+                      <a:ext cx="6200775" cy="2508250"/>
                     </a:xfrm>
                     <a:prstGeom prst="rect">
                       <a:avLst/>
@@ -1428,6 +1439,12 @@
                 </pic:pic>
               </a:graphicData>
             </a:graphic>
+            <wp14:sizeRelH relativeFrom="margin">
+              <wp14:pctWidth>0</wp14:pctWidth>
+            </wp14:sizeRelH>
+            <wp14:sizeRelV relativeFrom="margin">
+              <wp14:pctHeight>0</wp14:pctHeight>
+            </wp14:sizeRelV>
           </wp:anchor>
         </w:drawing>
       </w:r>
@@ -1442,7 +1459,6 @@
     <w:p>
       <w:pPr>
         <w:spacing w:line="240" w:lineRule="auto"/>
-        <w:jc w:val="center"/>
         <w:rPr>
           <w:sz w:val="16"/>
           <w:szCs w:val="16"/>
@@ -1451,16 +1467,6 @@
     </w:p>
     <w:p>
       <w:pPr>
-        <w:spacing w:line="240" w:lineRule="auto"/>
-        <w:jc w:val="center"/>
-        <w:rPr>
-          <w:sz w:val="16"/>
-          <w:szCs w:val="16"/>
-        </w:rPr>
-      </w:pPr>
-    </w:p>
-    <w:p>
-      <w:pPr>
         <w:ind w:firstLine="708"/>
         <w:jc w:val="both"/>
         <w:rPr>
@@ -1682,16 +1688,16 @@
           <w:lang w:eastAsia="ru-RU"/>
         </w:rPr>
         <w:drawing>
-          <wp:anchor distT="0" distB="0" distL="114300" distR="114300" simplePos="0" relativeHeight="251659264" behindDoc="0" locked="0" layoutInCell="1" allowOverlap="1" wp14:anchorId="7010F7A6" wp14:editId="55F97CB6">
+          <wp:anchor distT="0" distB="0" distL="114300" distR="114300" simplePos="0" relativeHeight="251658240" behindDoc="0" locked="0" layoutInCell="1" allowOverlap="1" wp14:anchorId="7010F7A6" wp14:editId="2FC17EC5">
             <wp:simplePos x="0" y="0"/>
             <wp:positionH relativeFrom="column">
-              <wp:posOffset>1104265</wp:posOffset>
+              <wp:posOffset>1453515</wp:posOffset>
             </wp:positionH>
             <wp:positionV relativeFrom="paragraph">
-              <wp:posOffset>1039495</wp:posOffset>
+              <wp:posOffset>1062990</wp:posOffset>
             </wp:positionV>
-            <wp:extent cx="4193540" cy="1985645"/>
-            <wp:effectExtent l="19050" t="0" r="0" b="0"/>
+            <wp:extent cx="3117850" cy="1476375"/>
+            <wp:effectExtent l="0" t="0" r="0" b="0"/>
             <wp:wrapTopAndBottom/>
             <wp:docPr id="9" name="Рисунок 9"/>
             <wp:cNvGraphicFramePr>
@@ -1716,7 +1722,7 @@
                   <pic:spPr bwMode="auto">
                     <a:xfrm>
                       <a:off x="0" y="0"/>
-                      <a:ext cx="4193540" cy="1985645"/>
+                      <a:ext cx="3117850" cy="1476375"/>
                     </a:xfrm>
                     <a:prstGeom prst="rect">
                       <a:avLst/>
@@ -1732,6 +1738,12 @@
                 </pic:pic>
               </a:graphicData>
             </a:graphic>
+            <wp14:sizeRelH relativeFrom="margin">
+              <wp14:pctWidth>0</wp14:pctWidth>
+            </wp14:sizeRelH>
+            <wp14:sizeRelV relativeFrom="margin">
+              <wp14:pctHeight>0</wp14:pctHeight>
+            </wp14:sizeRelV>
           </wp:anchor>
         </w:drawing>
       </w:r>
@@ -1777,31 +1789,8 @@
           <w:sz w:val="28"/>
           <w:szCs w:val="28"/>
         </w:rPr>
-        <w:t xml:space="preserve">таблицы), представленным на рисунке </w:t>
-      </w:r>
-      <w:proofErr w:type="gramStart"/>
-      <w:r>
-        <w:rPr>
-          <w:sz w:val="28"/>
-          <w:szCs w:val="28"/>
-        </w:rPr>
-        <w:t>2</w:t>
-      </w:r>
-      <w:r>
-        <w:rPr>
-          <w:sz w:val="28"/>
-          <w:szCs w:val="28"/>
-        </w:rPr>
-        <w:t xml:space="preserve"> </w:t>
-      </w:r>
-      <w:r>
-        <w:rPr>
-          <w:sz w:val="28"/>
-          <w:szCs w:val="28"/>
-        </w:rPr>
-        <w:t>:</w:t>
-      </w:r>
-      <w:proofErr w:type="gramEnd"/>
+        <w:t>таблицы), представленным на рисунке 2:</w:t>
+      </w:r>
     </w:p>
     <w:p>
       <w:pPr>
@@ -1817,26 +1806,26 @@
           <w:sz w:val="16"/>
           <w:szCs w:val="16"/>
         </w:rPr>
+        <w:t>Рис.2 Контекстное меню исследования</w:t>
+      </w:r>
+    </w:p>
+    <w:p>
+      <w:pPr>
+        <w:ind w:firstLine="708"/>
+        <w:jc w:val="both"/>
+        <w:rPr>
+          <w:sz w:val="28"/>
+          <w:szCs w:val="28"/>
+        </w:rPr>
+      </w:pPr>
+      <w:r>
+        <w:rPr>
+          <w:b/>
+          <w:bCs/>
+          <w:sz w:val="28"/>
+          <w:szCs w:val="28"/>
+        </w:rPr>
         <w:lastRenderedPageBreak/>
-        <w:t>Рис.2 Контекстное меню исследования</w:t>
-      </w:r>
-    </w:p>
-    <w:p>
-      <w:pPr>
-        <w:ind w:firstLine="708"/>
-        <w:jc w:val="both"/>
-        <w:rPr>
-          <w:sz w:val="28"/>
-          <w:szCs w:val="28"/>
-        </w:rPr>
-      </w:pPr>
-      <w:r>
-        <w:rPr>
-          <w:b/>
-          <w:bCs/>
-          <w:sz w:val="28"/>
-          <w:szCs w:val="28"/>
-        </w:rPr>
         <w:t>«Отозвать с описания»</w:t>
       </w:r>
       <w:r>
@@ -2011,7 +2000,7 @@
           <w:lang w:val="en-US"/>
         </w:rPr>
         <w:drawing>
-          <wp:inline distT="0" distB="0" distL="0" distR="0" wp14:anchorId="7E87F457" wp14:editId="0D25DF78">
+          <wp:inline distT="0" distB="0" distL="0" distR="0" wp14:anchorId="7E87F457" wp14:editId="2D2921CF">
             <wp:extent cx="2131060" cy="723265"/>
             <wp:effectExtent l="0" t="0" r="0" b="0"/>
             <wp:docPr id="1" name="Рисунок 1"/>
@@ -2100,21 +2089,7 @@
           <w:sz w:val="28"/>
           <w:szCs w:val="28"/>
         </w:rPr>
-        <w:t xml:space="preserve"> – открывает окно анамнеза пациента, доступно</w:t>
-      </w:r>
-      <w:r>
-        <w:rPr>
-          <w:sz w:val="28"/>
-          <w:szCs w:val="28"/>
-        </w:rPr>
-        <w:t>е</w:t>
-      </w:r>
-      <w:r>
-        <w:rPr>
-          <w:sz w:val="28"/>
-          <w:szCs w:val="28"/>
-        </w:rPr>
-        <w:t xml:space="preserve"> для редактирования только локальным пользователям, удаленные пользователи и пользователи с функцией только просмотр, могут только просматривать эти данные. </w:t>
+        <w:t xml:space="preserve"> – открывает окно анамнеза пациента, доступное для редактирования только локальным пользователям, удаленные пользователи и пользователи с функцией только просмотр, могут только просматривать эти данные. </w:t>
       </w:r>
     </w:p>
     <w:p>
@@ -2160,6 +2135,35 @@
           <w:sz w:val="28"/>
           <w:szCs w:val="28"/>
         </w:rPr>
+        <w:t xml:space="preserve"> – </w:t>
+      </w:r>
+      <w:r>
+        <w:rPr>
+          <w:sz w:val="28"/>
+          <w:szCs w:val="28"/>
+        </w:rPr>
+        <w:t xml:space="preserve">открывает на новой странице, просмотрщик </w:t>
+      </w:r>
+      <w:r>
+        <w:rPr>
+          <w:sz w:val="28"/>
+          <w:szCs w:val="28"/>
+          <w:lang w:val="en-US"/>
+        </w:rPr>
+        <w:t>DICOM</w:t>
+      </w:r>
+      <w:r>
+        <w:rPr>
+          <w:sz w:val="28"/>
+          <w:szCs w:val="28"/>
+        </w:rPr>
+        <w:t>-снимков</w:t>
+      </w:r>
+      <w:r>
+        <w:rPr>
+          <w:sz w:val="28"/>
+          <w:szCs w:val="28"/>
+        </w:rPr>
         <w:t xml:space="preserve"> </w:t>
       </w:r>
       <w:r>
@@ -2167,7 +2171,73 @@
           <w:sz w:val="28"/>
           <w:szCs w:val="28"/>
         </w:rPr>
-        <w:t>–</w:t>
+        <w:t>с данным исследованием.</w:t>
+      </w:r>
+    </w:p>
+    <w:p>
+      <w:pPr>
+        <w:ind w:firstLine="708"/>
+        <w:jc w:val="both"/>
+        <w:rPr>
+          <w:sz w:val="28"/>
+          <w:szCs w:val="28"/>
+        </w:rPr>
+      </w:pPr>
+      <w:r>
+        <w:rPr>
+          <w:b/>
+          <w:bCs/>
+          <w:sz w:val="28"/>
+          <w:szCs w:val="28"/>
+        </w:rPr>
+        <w:t>Результат/Описание</w:t>
+      </w:r>
+      <w:r>
+        <w:rPr>
+          <w:sz w:val="28"/>
+          <w:szCs w:val="28"/>
+        </w:rPr>
+        <w:t xml:space="preserve"> – если исследование уже описано, то данная иконка будет активна, и по нажатию на неё, будет загружен файл с описанием/результатом.</w:t>
+      </w:r>
+    </w:p>
+    <w:p>
+      <w:pPr>
+        <w:ind w:firstLine="708"/>
+        <w:jc w:val="both"/>
+        <w:rPr>
+          <w:sz w:val="28"/>
+          <w:szCs w:val="28"/>
+        </w:rPr>
+      </w:pPr>
+      <w:r>
+        <w:rPr>
+          <w:b/>
+          <w:bCs/>
+          <w:sz w:val="28"/>
+          <w:szCs w:val="28"/>
+        </w:rPr>
+        <w:t>Взять на описание</w:t>
+      </w:r>
+      <w:r>
+        <w:rPr>
+          <w:sz w:val="28"/>
+          <w:szCs w:val="28"/>
+        </w:rPr>
+        <w:t xml:space="preserve"> – с помощью данной кнопки, можно взять исследование на описание. Исследование при этом,</w:t>
+      </w:r>
+      <w:r>
+        <w:rPr>
+          <w:sz w:val="28"/>
+          <w:szCs w:val="28"/>
+        </w:rPr>
+        <w:t xml:space="preserve"> будет заблокировано и не доступно для анализа другим пользователям</w:t>
+      </w:r>
+      <w:r>
+        <w:rPr>
+          <w:sz w:val="28"/>
+          <w:szCs w:val="28"/>
+        </w:rPr>
+        <w:t>,</w:t>
       </w:r>
       <w:r>
         <w:rPr>
@@ -2181,14 +2251,59 @@
           <w:sz w:val="28"/>
           <w:szCs w:val="28"/>
         </w:rPr>
-        <w:t xml:space="preserve">открывает </w:t>
-      </w:r>
-      <w:r>
-        <w:rPr>
-          <w:sz w:val="28"/>
-          <w:szCs w:val="28"/>
-        </w:rPr>
-        <w:t xml:space="preserve">на новой странице, просмотрщик </w:t>
+        <w:t>а</w:t>
+      </w:r>
+      <w:r>
+        <w:rPr>
+          <w:sz w:val="28"/>
+          <w:szCs w:val="28"/>
+        </w:rPr>
+        <w:t xml:space="preserve"> не сможете приступить к другим исследованиям пока не опишите это. Срок</w:t>
+      </w:r>
+      <w:r>
+        <w:rPr>
+          <w:sz w:val="28"/>
+          <w:szCs w:val="28"/>
+        </w:rPr>
+        <w:t>,</w:t>
+      </w:r>
+      <w:r>
+        <w:rPr>
+          <w:sz w:val="28"/>
+          <w:szCs w:val="28"/>
+        </w:rPr>
+        <w:t xml:space="preserve"> </w:t>
+      </w:r>
+      <w:r>
+        <w:rPr>
+          <w:sz w:val="28"/>
+          <w:szCs w:val="28"/>
+        </w:rPr>
+        <w:t>на который можно заблокировать исследование, определяется администратором, по умолчанию 24 часа</w:t>
+      </w:r>
+      <w:r>
+        <w:rPr>
+          <w:sz w:val="28"/>
+          <w:szCs w:val="28"/>
+        </w:rPr>
+        <w:t>. После истечения этого срока, исследование будет автоматически разблокировано и станет доступно для просмотра другим пользователям!</w:t>
+      </w:r>
+    </w:p>
+    <w:p>
+      <w:pPr>
+        <w:ind w:firstLine="708"/>
+        <w:jc w:val="both"/>
+        <w:rPr>
+          <w:sz w:val="28"/>
+          <w:szCs w:val="28"/>
+        </w:rPr>
+      </w:pPr>
+      <w:r>
+        <w:rPr>
+          <w:sz w:val="28"/>
+          <w:szCs w:val="28"/>
+        </w:rPr>
+        <w:t xml:space="preserve">Каждое исследование в </w:t>
       </w:r>
       <w:r>
         <w:rPr>
@@ -2196,28 +2311,14 @@
           <w:szCs w:val="28"/>
           <w:lang w:val="en-US"/>
         </w:rPr>
-        <w:t>DICOM</w:t>
-      </w:r>
-      <w:r>
-        <w:rPr>
-          <w:sz w:val="28"/>
-          <w:szCs w:val="28"/>
-        </w:rPr>
-        <w:t>-снимков</w:t>
-      </w:r>
-      <w:r>
-        <w:rPr>
-          <w:sz w:val="28"/>
-          <w:szCs w:val="28"/>
-        </w:rPr>
-        <w:t xml:space="preserve"> </w:t>
-      </w:r>
-      <w:r>
-        <w:rPr>
-          <w:sz w:val="28"/>
-          <w:szCs w:val="28"/>
-        </w:rPr>
-        <w:t>с данным исследованием.</w:t>
+        <w:t>CRUD</w:t>
+      </w:r>
+      <w:r>
+        <w:rPr>
+          <w:sz w:val="28"/>
+          <w:szCs w:val="28"/>
+        </w:rPr>
+        <w:t xml:space="preserve">-таблице, может иметь один из следующих статусов: </w:t>
       </w:r>
     </w:p>
     <w:p>
@@ -2236,35 +2337,14 @@
           <w:sz w:val="28"/>
           <w:szCs w:val="28"/>
         </w:rPr>
-        <w:t>Результат/Описание</w:t>
-      </w:r>
-      <w:r>
-        <w:rPr>
-          <w:sz w:val="28"/>
-          <w:szCs w:val="28"/>
-        </w:rPr>
-        <w:t xml:space="preserve"> </w:t>
-      </w:r>
-      <w:r>
-        <w:rPr>
-          <w:sz w:val="28"/>
-          <w:szCs w:val="28"/>
-        </w:rPr>
-        <w:t>–</w:t>
-      </w:r>
-      <w:r>
-        <w:rPr>
-          <w:sz w:val="28"/>
-          <w:szCs w:val="28"/>
-        </w:rPr>
-        <w:t xml:space="preserve"> </w:t>
-      </w:r>
-      <w:r>
-        <w:rPr>
-          <w:sz w:val="28"/>
-          <w:szCs w:val="28"/>
-        </w:rPr>
-        <w:t>если исследование уже описано, то данная иконка будет активна, и по нажатию на неё, будет загружен файл с описанием/результатом.</w:t>
+        <w:t>Не описан</w:t>
+      </w:r>
+      <w:r>
+        <w:rPr>
+          <w:sz w:val="28"/>
+          <w:szCs w:val="28"/>
+        </w:rPr>
+        <w:t xml:space="preserve"> – данное исследование доступно для описания.</w:t>
       </w:r>
     </w:p>
     <w:p>
@@ -2283,82 +2363,78 @@
           <w:sz w:val="28"/>
           <w:szCs w:val="28"/>
         </w:rPr>
-        <w:t>Взять на описание</w:t>
-      </w:r>
-      <w:r>
-        <w:rPr>
-          <w:sz w:val="28"/>
-          <w:szCs w:val="28"/>
-        </w:rPr>
-        <w:t xml:space="preserve"> – с помощью данной кнопки, можно взять исследование на описание. Исследование при этом,</w:t>
-      </w:r>
-      <w:r>
-        <w:rPr>
-          <w:sz w:val="28"/>
-          <w:szCs w:val="28"/>
-        </w:rPr>
-        <w:t xml:space="preserve"> будет заблокировано и не доступно для анализа другим пользователям</w:t>
-      </w:r>
-      <w:r>
-        <w:rPr>
-          <w:sz w:val="28"/>
-          <w:szCs w:val="28"/>
-        </w:rPr>
-        <w:t>,</w:t>
-      </w:r>
-      <w:r>
-        <w:rPr>
-          <w:sz w:val="28"/>
-          <w:szCs w:val="28"/>
-        </w:rPr>
-        <w:t xml:space="preserve"> </w:t>
-      </w:r>
-      <w:r>
-        <w:rPr>
-          <w:sz w:val="28"/>
-          <w:szCs w:val="28"/>
-        </w:rPr>
-        <w:t>а</w:t>
-      </w:r>
-      <w:r>
-        <w:rPr>
-          <w:sz w:val="28"/>
-          <w:szCs w:val="28"/>
-        </w:rPr>
-        <w:t xml:space="preserve"> не сможете приступить к другим исследованиям пока не опишите это. Срок</w:t>
-      </w:r>
-      <w:r>
-        <w:rPr>
-          <w:sz w:val="28"/>
-          <w:szCs w:val="28"/>
-        </w:rPr>
-        <w:t>,</w:t>
-      </w:r>
-      <w:r>
-        <w:rPr>
-          <w:sz w:val="28"/>
-          <w:szCs w:val="28"/>
-        </w:rPr>
-        <w:t xml:space="preserve"> </w:t>
-      </w:r>
-      <w:r>
-        <w:rPr>
-          <w:sz w:val="28"/>
-          <w:szCs w:val="28"/>
-        </w:rPr>
-        <w:t>на который можно заблокировать исследование, определяется администратором, по умолчанию 24 часа</w:t>
-      </w:r>
-      <w:r>
-        <w:rPr>
-          <w:sz w:val="28"/>
-          <w:szCs w:val="28"/>
-        </w:rPr>
-        <w:t>. После истечения этого срока, исследование будет автоматически разблокировано и станет доступно для просмотра другим пользователям!</w:t>
+        <w:lastRenderedPageBreak/>
+        <w:t>Описан</w:t>
+      </w:r>
+      <w:r>
+        <w:rPr>
+          <w:sz w:val="28"/>
+          <w:szCs w:val="28"/>
+        </w:rPr>
+        <w:t xml:space="preserve"> – данное исследование уже описано и к нему прикреплен результат.</w:t>
       </w:r>
     </w:p>
     <w:p>
       <w:pPr>
         <w:ind w:firstLine="708"/>
+        <w:jc w:val="both"/>
+        <w:rPr>
+          <w:sz w:val="28"/>
+          <w:szCs w:val="28"/>
+        </w:rPr>
+      </w:pPr>
+      <w:r>
+        <w:rPr>
+          <w:b/>
+          <w:bCs/>
+          <w:sz w:val="28"/>
+          <w:szCs w:val="28"/>
+        </w:rPr>
+        <w:t xml:space="preserve">Отправлен на описание </w:t>
+      </w:r>
+      <w:r>
+        <w:rPr>
+          <w:sz w:val="28"/>
+          <w:szCs w:val="28"/>
+        </w:rPr>
+        <w:t xml:space="preserve">– </w:t>
+      </w:r>
+      <w:r>
+        <w:rPr>
+          <w:sz w:val="28"/>
+          <w:szCs w:val="28"/>
+        </w:rPr>
+        <w:t>данное исследование отправлено на описание в группу пользователей, название группы можно увидеть в поле «Куда отправлен».</w:t>
+      </w:r>
+    </w:p>
+    <w:p>
+      <w:pPr>
+        <w:ind w:firstLine="708"/>
+        <w:jc w:val="both"/>
+        <w:rPr>
+          <w:sz w:val="28"/>
+          <w:szCs w:val="28"/>
+        </w:rPr>
+      </w:pPr>
+      <w:r>
+        <w:rPr>
+          <w:b/>
+          <w:bCs/>
+          <w:sz w:val="28"/>
+          <w:szCs w:val="28"/>
+        </w:rPr>
+        <w:t xml:space="preserve">Заблокирован для описания </w:t>
+      </w:r>
+      <w:r>
+        <w:rPr>
+          <w:sz w:val="28"/>
+          <w:szCs w:val="28"/>
+        </w:rPr>
+        <w:t>– данное исследование уже взял на описание один из пользователей системы.</w:t>
+      </w:r>
+    </w:p>
+    <w:p>
+      <w:pPr>
         <w:jc w:val="both"/>
         <w:rPr>
           <w:sz w:val="28"/>
@@ -2380,9 +2456,1966 @@
     <w:p>
       <w:pPr>
         <w:pStyle w:val="a3"/>
-        <w:ind w:left="1080"/>
-        <w:jc w:val="both"/>
-        <w:rPr>
+        <w:numPr>
+          <w:ilvl w:val="1"/>
+          <w:numId w:val="3"/>
+        </w:numPr>
+        <w:jc w:val="both"/>
+        <w:rPr>
+          <w:b/>
+          <w:bCs/>
+          <w:sz w:val="28"/>
+          <w:szCs w:val="28"/>
+        </w:rPr>
+      </w:pPr>
+      <w:r>
+        <w:rPr>
+          <w:b/>
+          <w:bCs/>
+          <w:sz w:val="28"/>
+          <w:szCs w:val="28"/>
+        </w:rPr>
+        <w:t xml:space="preserve">Текущее задание </w:t>
+      </w:r>
+    </w:p>
+    <w:p>
+      <w:pPr>
+        <w:ind w:firstLine="708"/>
+        <w:jc w:val="both"/>
+        <w:rPr>
+          <w:sz w:val="28"/>
+          <w:szCs w:val="28"/>
+        </w:rPr>
+      </w:pPr>
+      <w:r>
+        <w:rPr>
+          <w:noProof/>
+          <w:sz w:val="28"/>
+          <w:szCs w:val="28"/>
+          <w:lang w:val="en-US"/>
+        </w:rPr>
+        <w:drawing>
+          <wp:anchor distT="0" distB="0" distL="114300" distR="114300" simplePos="0" relativeHeight="251654656" behindDoc="0" locked="0" layoutInCell="1" allowOverlap="1" wp14:anchorId="03B1C8AA" wp14:editId="1E02DEAA">
+            <wp:simplePos x="0" y="0"/>
+            <wp:positionH relativeFrom="column">
+              <wp:posOffset>5715</wp:posOffset>
+            </wp:positionH>
+            <wp:positionV relativeFrom="paragraph">
+              <wp:posOffset>1039495</wp:posOffset>
+            </wp:positionV>
+            <wp:extent cx="5934075" cy="1828800"/>
+            <wp:effectExtent l="0" t="0" r="0" b="0"/>
+            <wp:wrapTopAndBottom/>
+            <wp:docPr id="2" name="Рисунок 2"/>
+            <wp:cNvGraphicFramePr>
+              <a:graphicFrameLocks xmlns:a="http://schemas.openxmlformats.org/drawingml/2006/main" noChangeAspect="1"/>
+            </wp:cNvGraphicFramePr>
+            <a:graphic xmlns:a="http://schemas.openxmlformats.org/drawingml/2006/main">
+              <a:graphicData uri="http://schemas.openxmlformats.org/drawingml/2006/picture">
+                <pic:pic xmlns:pic="http://schemas.openxmlformats.org/drawingml/2006/picture">
+                  <pic:nvPicPr>
+                    <pic:cNvPr id="0" name="Picture 1"/>
+                    <pic:cNvPicPr>
+                      <a:picLocks noChangeAspect="1" noChangeArrowheads="1"/>
+                    </pic:cNvPicPr>
+                  </pic:nvPicPr>
+                  <pic:blipFill>
+                    <a:blip r:embed="rId10">
+                      <a:extLst>
+                        <a:ext uri="{28A0092B-C50C-407E-A947-70E740481C1C}">
+                          <a14:useLocalDpi xmlns:a14="http://schemas.microsoft.com/office/drawing/2010/main" val="0"/>
+                        </a:ext>
+                      </a:extLst>
+                    </a:blip>
+                    <a:srcRect/>
+                    <a:stretch>
+                      <a:fillRect/>
+                    </a:stretch>
+                  </pic:blipFill>
+                  <pic:spPr bwMode="auto">
+                    <a:xfrm>
+                      <a:off x="0" y="0"/>
+                      <a:ext cx="5934075" cy="1828800"/>
+                    </a:xfrm>
+                    <a:prstGeom prst="rect">
+                      <a:avLst/>
+                    </a:prstGeom>
+                    <a:noFill/>
+                    <a:ln>
+                      <a:noFill/>
+                    </a:ln>
+                  </pic:spPr>
+                </pic:pic>
+              </a:graphicData>
+            </a:graphic>
+          </wp:anchor>
+        </w:drawing>
+      </w:r>
+      <w:r>
+        <w:rPr>
+          <w:sz w:val="28"/>
+          <w:szCs w:val="28"/>
+        </w:rPr>
+        <w:t>На рисунке 3, отображен общий вид страницы «Текущее задание».</w:t>
+      </w:r>
+      <w:r>
+        <w:rPr>
+          <w:sz w:val="28"/>
+          <w:szCs w:val="28"/>
+        </w:rPr>
+        <w:t xml:space="preserve"> На данной странице отображается текущее, выбранное вами задание, если в данный момент у вас нет ни одного выбранного задания, то данная ссылка будет не активна на домашней странице. </w:t>
+      </w:r>
+    </w:p>
+    <w:p>
+      <w:pPr>
+        <w:ind w:firstLine="708"/>
+        <w:jc w:val="center"/>
+        <w:rPr>
+          <w:sz w:val="16"/>
+          <w:szCs w:val="16"/>
+        </w:rPr>
+      </w:pPr>
+      <w:r>
+        <w:rPr>
+          <w:sz w:val="16"/>
+          <w:szCs w:val="16"/>
+        </w:rPr>
+        <w:t>Рис.4 Страница «Текущее задание»</w:t>
+      </w:r>
+    </w:p>
+    <w:p>
+      <w:pPr>
+        <w:ind w:firstLine="708"/>
+        <w:jc w:val="center"/>
+        <w:rPr>
+          <w:sz w:val="16"/>
+          <w:szCs w:val="16"/>
+        </w:rPr>
+      </w:pPr>
+    </w:p>
+    <w:p>
+      <w:pPr>
+        <w:ind w:firstLine="708"/>
+        <w:jc w:val="both"/>
+        <w:rPr>
+          <w:sz w:val="28"/>
+          <w:szCs w:val="28"/>
+        </w:rPr>
+      </w:pPr>
+      <w:r>
+        <w:rPr>
+          <w:sz w:val="28"/>
+          <w:szCs w:val="28"/>
+        </w:rPr>
+        <w:t>Пользователю доступны следующие операции над текущим заданием:</w:t>
+      </w:r>
+    </w:p>
+    <w:p>
+      <w:pPr>
+        <w:ind w:firstLine="708"/>
+        <w:jc w:val="both"/>
+        <w:rPr>
+          <w:sz w:val="28"/>
+          <w:szCs w:val="28"/>
+        </w:rPr>
+      </w:pPr>
+      <w:r>
+        <w:rPr>
+          <w:b/>
+          <w:bCs/>
+          <w:sz w:val="28"/>
+          <w:szCs w:val="28"/>
+        </w:rPr>
+        <w:t>Анамнез</w:t>
+      </w:r>
+      <w:r>
+        <w:rPr>
+          <w:sz w:val="28"/>
+          <w:szCs w:val="28"/>
+        </w:rPr>
+        <w:t xml:space="preserve"> – открывает окно анамнеза пациента, доступное для редактирования только локальным пользователям, удаленные пользователи и пользователи с функцией только просмотр, могут только просматривать эти данные. </w:t>
+      </w:r>
+    </w:p>
+    <w:p>
+      <w:pPr>
+        <w:ind w:firstLine="708"/>
+        <w:jc w:val="both"/>
+        <w:rPr>
+          <w:sz w:val="28"/>
+          <w:szCs w:val="28"/>
+        </w:rPr>
+      </w:pPr>
+      <w:r>
+        <w:rPr>
+          <w:b/>
+          <w:bCs/>
+          <w:sz w:val="28"/>
+          <w:szCs w:val="28"/>
+        </w:rPr>
+        <w:t xml:space="preserve">Открыть в </w:t>
+      </w:r>
+      <w:r>
+        <w:rPr>
+          <w:b/>
+          <w:bCs/>
+          <w:sz w:val="28"/>
+          <w:szCs w:val="28"/>
+          <w:lang w:val="en-US"/>
+        </w:rPr>
+        <w:t>O</w:t>
+      </w:r>
+      <w:r>
+        <w:rPr>
+          <w:b/>
+          <w:bCs/>
+          <w:sz w:val="28"/>
+          <w:szCs w:val="28"/>
+          <w:lang w:val="en-US"/>
+        </w:rPr>
+        <w:t>SIMIS</w:t>
+      </w:r>
+      <w:r>
+        <w:rPr>
+          <w:sz w:val="28"/>
+          <w:szCs w:val="28"/>
+        </w:rPr>
+        <w:t xml:space="preserve"> – </w:t>
+      </w:r>
+      <w:r>
+        <w:rPr>
+          <w:sz w:val="28"/>
+          <w:szCs w:val="28"/>
+        </w:rPr>
+        <w:t xml:space="preserve">открывает на новой странице, просмотрщик </w:t>
+      </w:r>
+      <w:r>
+        <w:rPr>
+          <w:sz w:val="28"/>
+          <w:szCs w:val="28"/>
+          <w:lang w:val="en-US"/>
+        </w:rPr>
+        <w:t>DICOM</w:t>
+      </w:r>
+      <w:r>
+        <w:rPr>
+          <w:sz w:val="28"/>
+          <w:szCs w:val="28"/>
+        </w:rPr>
+        <w:t>-снимков</w:t>
+      </w:r>
+      <w:r>
+        <w:rPr>
+          <w:sz w:val="28"/>
+          <w:szCs w:val="28"/>
+        </w:rPr>
+        <w:t xml:space="preserve"> </w:t>
+      </w:r>
+      <w:r>
+        <w:rPr>
+          <w:sz w:val="28"/>
+          <w:szCs w:val="28"/>
+        </w:rPr>
+        <w:t>с данным исследованием.</w:t>
+      </w:r>
+    </w:p>
+    <w:p>
+      <w:pPr>
+        <w:ind w:firstLine="708"/>
+        <w:jc w:val="both"/>
+        <w:rPr>
+          <w:sz w:val="28"/>
+          <w:szCs w:val="28"/>
+        </w:rPr>
+      </w:pPr>
+      <w:r>
+        <w:rPr>
+          <w:noProof/>
+          <w:sz w:val="28"/>
+          <w:szCs w:val="28"/>
+        </w:rPr>
+        <w:lastRenderedPageBreak/>
+        <w:drawing>
+          <wp:anchor distT="0" distB="0" distL="114300" distR="114300" simplePos="0" relativeHeight="251659776" behindDoc="0" locked="0" layoutInCell="1" allowOverlap="1" wp14:anchorId="70565581" wp14:editId="6F24D8C7">
+            <wp:simplePos x="0" y="0"/>
+            <wp:positionH relativeFrom="column">
+              <wp:posOffset>853440</wp:posOffset>
+            </wp:positionH>
+            <wp:positionV relativeFrom="paragraph">
+              <wp:posOffset>842010</wp:posOffset>
+            </wp:positionV>
+            <wp:extent cx="4229100" cy="2289810"/>
+            <wp:effectExtent l="0" t="0" r="0" b="0"/>
+            <wp:wrapTopAndBottom/>
+            <wp:docPr id="3" name="Рисунок 3"/>
+            <wp:cNvGraphicFramePr>
+              <a:graphicFrameLocks xmlns:a="http://schemas.openxmlformats.org/drawingml/2006/main" noChangeAspect="1"/>
+            </wp:cNvGraphicFramePr>
+            <a:graphic xmlns:a="http://schemas.openxmlformats.org/drawingml/2006/main">
+              <a:graphicData uri="http://schemas.openxmlformats.org/drawingml/2006/picture">
+                <pic:pic xmlns:pic="http://schemas.openxmlformats.org/drawingml/2006/picture">
+                  <pic:nvPicPr>
+                    <pic:cNvPr id="0" name="Picture 2"/>
+                    <pic:cNvPicPr>
+                      <a:picLocks noChangeAspect="1" noChangeArrowheads="1"/>
+                    </pic:cNvPicPr>
+                  </pic:nvPicPr>
+                  <pic:blipFill>
+                    <a:blip r:embed="rId11">
+                      <a:extLst>
+                        <a:ext uri="{28A0092B-C50C-407E-A947-70E740481C1C}">
+                          <a14:useLocalDpi xmlns:a14="http://schemas.microsoft.com/office/drawing/2010/main" val="0"/>
+                        </a:ext>
+                      </a:extLst>
+                    </a:blip>
+                    <a:srcRect/>
+                    <a:stretch>
+                      <a:fillRect/>
+                    </a:stretch>
+                  </pic:blipFill>
+                  <pic:spPr bwMode="auto">
+                    <a:xfrm>
+                      <a:off x="0" y="0"/>
+                      <a:ext cx="4229100" cy="2289810"/>
+                    </a:xfrm>
+                    <a:prstGeom prst="rect">
+                      <a:avLst/>
+                    </a:prstGeom>
+                    <a:noFill/>
+                    <a:ln>
+                      <a:noFill/>
+                    </a:ln>
+                  </pic:spPr>
+                </pic:pic>
+              </a:graphicData>
+            </a:graphic>
+            <wp14:sizeRelH relativeFrom="margin">
+              <wp14:pctWidth>0</wp14:pctWidth>
+            </wp14:sizeRelH>
+            <wp14:sizeRelV relativeFrom="margin">
+              <wp14:pctHeight>0</wp14:pctHeight>
+            </wp14:sizeRelV>
+          </wp:anchor>
+        </w:drawing>
+      </w:r>
+      <w:r>
+        <w:rPr>
+          <w:b/>
+          <w:bCs/>
+          <w:sz w:val="28"/>
+          <w:szCs w:val="28"/>
+        </w:rPr>
+        <w:t>Загрузить файл результата</w:t>
+      </w:r>
+      <w:r>
+        <w:rPr>
+          <w:sz w:val="28"/>
+          <w:szCs w:val="28"/>
+        </w:rPr>
+        <w:t xml:space="preserve"> – </w:t>
+      </w:r>
+      <w:r>
+        <w:rPr>
+          <w:sz w:val="28"/>
+          <w:szCs w:val="28"/>
+        </w:rPr>
+        <w:t>данная иконка вызывает окно загрузки файла результата. Внешний вид окна загрузки файла результата представлен на рисунке 5.</w:t>
+      </w:r>
+    </w:p>
+    <w:p>
+      <w:pPr>
+        <w:ind w:firstLine="708"/>
+        <w:jc w:val="center"/>
+        <w:rPr>
+          <w:sz w:val="16"/>
+          <w:szCs w:val="16"/>
+        </w:rPr>
+      </w:pPr>
+    </w:p>
+    <w:p>
+      <w:pPr>
+        <w:ind w:firstLine="708"/>
+        <w:jc w:val="center"/>
+        <w:rPr>
+          <w:sz w:val="16"/>
+          <w:szCs w:val="16"/>
+        </w:rPr>
+      </w:pPr>
+      <w:r>
+        <w:rPr>
+          <w:sz w:val="16"/>
+          <w:szCs w:val="16"/>
+        </w:rPr>
+        <w:t>Рис.5 Окно загрузки файла описания</w:t>
+      </w:r>
+    </w:p>
+    <w:p>
+      <w:pPr>
+        <w:ind w:firstLine="708"/>
+        <w:jc w:val="both"/>
+        <w:rPr>
+          <w:sz w:val="28"/>
+          <w:szCs w:val="28"/>
+        </w:rPr>
+      </w:pPr>
+      <w:r>
+        <w:rPr>
+          <w:sz w:val="28"/>
+          <w:szCs w:val="28"/>
+        </w:rPr>
+        <w:t>Для загрузки файла результата</w:t>
+      </w:r>
+      <w:r>
+        <w:rPr>
+          <w:sz w:val="28"/>
+          <w:szCs w:val="28"/>
+        </w:rPr>
+        <w:t xml:space="preserve">, в данном окне кликните левой клавишей мыши, по кнопке «Выбрать», после чего в открывшемся проводнике, выберите файл, который хотите прикрепить. Прикреплять можно только файлы следующих форматов: </w:t>
+      </w:r>
+      <w:proofErr w:type="spellStart"/>
+      <w:proofErr w:type="gramStart"/>
+      <w:r>
+        <w:rPr>
+          <w:sz w:val="28"/>
+          <w:szCs w:val="28"/>
+        </w:rPr>
+        <w:t>gif</w:t>
+      </w:r>
+      <w:proofErr w:type="spellEnd"/>
+      <w:r>
+        <w:rPr>
+          <w:sz w:val="28"/>
+          <w:szCs w:val="28"/>
+        </w:rPr>
+        <w:t xml:space="preserve"> </w:t>
+      </w:r>
+      <w:r>
+        <w:rPr>
+          <w:sz w:val="28"/>
+          <w:szCs w:val="28"/>
+        </w:rPr>
+        <w:t>,</w:t>
+      </w:r>
+      <w:proofErr w:type="gramEnd"/>
+      <w:r>
+        <w:rPr>
+          <w:sz w:val="28"/>
+          <w:szCs w:val="28"/>
+        </w:rPr>
+        <w:t xml:space="preserve"> </w:t>
+      </w:r>
+      <w:proofErr w:type="spellStart"/>
+      <w:r>
+        <w:rPr>
+          <w:sz w:val="28"/>
+          <w:szCs w:val="28"/>
+        </w:rPr>
+        <w:t>jpg</w:t>
+      </w:r>
+      <w:proofErr w:type="spellEnd"/>
+      <w:r>
+        <w:rPr>
+          <w:sz w:val="28"/>
+          <w:szCs w:val="28"/>
+        </w:rPr>
+        <w:t xml:space="preserve"> </w:t>
+      </w:r>
+      <w:r>
+        <w:rPr>
+          <w:sz w:val="28"/>
+          <w:szCs w:val="28"/>
+        </w:rPr>
+        <w:t>,</w:t>
+      </w:r>
+      <w:r>
+        <w:rPr>
+          <w:sz w:val="28"/>
+          <w:szCs w:val="28"/>
+        </w:rPr>
+        <w:t xml:space="preserve"> </w:t>
+      </w:r>
+      <w:proofErr w:type="spellStart"/>
+      <w:r>
+        <w:rPr>
+          <w:sz w:val="28"/>
+          <w:szCs w:val="28"/>
+        </w:rPr>
+        <w:t>jpeg</w:t>
+      </w:r>
+      <w:proofErr w:type="spellEnd"/>
+      <w:r>
+        <w:rPr>
+          <w:sz w:val="28"/>
+          <w:szCs w:val="28"/>
+        </w:rPr>
+        <w:t xml:space="preserve"> </w:t>
+      </w:r>
+      <w:r>
+        <w:rPr>
+          <w:sz w:val="28"/>
+          <w:szCs w:val="28"/>
+        </w:rPr>
+        <w:t>,</w:t>
+      </w:r>
+      <w:r>
+        <w:rPr>
+          <w:sz w:val="28"/>
+          <w:szCs w:val="28"/>
+        </w:rPr>
+        <w:t xml:space="preserve"> </w:t>
+      </w:r>
+      <w:proofErr w:type="spellStart"/>
+      <w:r>
+        <w:rPr>
+          <w:sz w:val="28"/>
+          <w:szCs w:val="28"/>
+        </w:rPr>
+        <w:t>png</w:t>
+      </w:r>
+      <w:proofErr w:type="spellEnd"/>
+      <w:r>
+        <w:rPr>
+          <w:sz w:val="28"/>
+          <w:szCs w:val="28"/>
+        </w:rPr>
+        <w:t xml:space="preserve"> </w:t>
+      </w:r>
+      <w:r>
+        <w:rPr>
+          <w:sz w:val="28"/>
+          <w:szCs w:val="28"/>
+        </w:rPr>
+        <w:t>,</w:t>
+      </w:r>
+      <w:r>
+        <w:rPr>
+          <w:sz w:val="28"/>
+          <w:szCs w:val="28"/>
+        </w:rPr>
+        <w:t xml:space="preserve"> </w:t>
+      </w:r>
+      <w:proofErr w:type="spellStart"/>
+      <w:r>
+        <w:rPr>
+          <w:sz w:val="28"/>
+          <w:szCs w:val="28"/>
+        </w:rPr>
+        <w:t>doc</w:t>
+      </w:r>
+      <w:proofErr w:type="spellEnd"/>
+      <w:r>
+        <w:rPr>
+          <w:sz w:val="28"/>
+          <w:szCs w:val="28"/>
+        </w:rPr>
+        <w:t xml:space="preserve"> </w:t>
+      </w:r>
+      <w:r>
+        <w:rPr>
+          <w:sz w:val="28"/>
+          <w:szCs w:val="28"/>
+        </w:rPr>
+        <w:t>,</w:t>
+      </w:r>
+      <w:r>
+        <w:rPr>
+          <w:sz w:val="28"/>
+          <w:szCs w:val="28"/>
+        </w:rPr>
+        <w:t xml:space="preserve"> </w:t>
+      </w:r>
+      <w:proofErr w:type="spellStart"/>
+      <w:r>
+        <w:rPr>
+          <w:sz w:val="28"/>
+          <w:szCs w:val="28"/>
+        </w:rPr>
+        <w:t>docx</w:t>
+      </w:r>
+      <w:proofErr w:type="spellEnd"/>
+      <w:r>
+        <w:rPr>
+          <w:sz w:val="28"/>
+          <w:szCs w:val="28"/>
+        </w:rPr>
+        <w:t>.</w:t>
+      </w:r>
+      <w:r>
+        <w:rPr>
+          <w:sz w:val="28"/>
+          <w:szCs w:val="28"/>
+        </w:rPr>
+        <w:t xml:space="preserve"> Если выбранный файл соответствует условиям, то вы увидите две новые кнопки «Загрузить и сохранить» и «Отмена». </w:t>
+      </w:r>
+      <w:r>
+        <w:rPr>
+          <w:sz w:val="28"/>
+          <w:szCs w:val="28"/>
+        </w:rPr>
+        <w:t>После того, как вы нажмете кнопку «Загрузить и сохранить», выбранный вами файл будет прикреплен к исследованию и доступен для просмотра другим пользователям, статус исследования будет изменен на «Описан», вы будете перемещены на домашнюю страницу.</w:t>
+      </w:r>
+    </w:p>
+    <w:p>
+      <w:pPr>
+        <w:ind w:firstLine="708"/>
+        <w:jc w:val="both"/>
+        <w:rPr>
+          <w:sz w:val="28"/>
+          <w:szCs w:val="28"/>
+        </w:rPr>
+      </w:pPr>
+    </w:p>
+    <w:p>
+      <w:pPr>
+        <w:pStyle w:val="a3"/>
+        <w:numPr>
+          <w:ilvl w:val="1"/>
+          <w:numId w:val="3"/>
+        </w:numPr>
+        <w:jc w:val="both"/>
+        <w:rPr>
+          <w:b/>
+          <w:bCs/>
+          <w:sz w:val="28"/>
+          <w:szCs w:val="28"/>
+        </w:rPr>
+      </w:pPr>
+      <w:r>
+        <w:rPr>
+          <w:b/>
+          <w:bCs/>
+          <w:sz w:val="28"/>
+          <w:szCs w:val="28"/>
+        </w:rPr>
+        <w:t>Мои описания</w:t>
+      </w:r>
+    </w:p>
+    <w:p>
+      <w:pPr>
+        <w:jc w:val="both"/>
+        <w:rPr>
+          <w:sz w:val="28"/>
+          <w:szCs w:val="28"/>
+        </w:rPr>
+      </w:pPr>
+      <w:r>
+        <w:rPr>
+          <w:sz w:val="28"/>
+          <w:szCs w:val="28"/>
+        </w:rPr>
+        <w:t>На данной странице вы можете увидеть таблицу, где будут</w:t>
+      </w:r>
+      <w:r>
+        <w:rPr>
+          <w:sz w:val="28"/>
+          <w:szCs w:val="28"/>
+        </w:rPr>
+        <w:t xml:space="preserve"> </w:t>
+      </w:r>
+      <w:r>
+        <w:rPr>
+          <w:sz w:val="28"/>
+          <w:szCs w:val="28"/>
+        </w:rPr>
+        <w:t xml:space="preserve">отображены все сделанные вами в системе описания. </w:t>
+      </w:r>
+      <w:r>
+        <w:rPr>
+          <w:sz w:val="28"/>
+          <w:szCs w:val="28"/>
+        </w:rPr>
+        <w:t>Каждая запись в таблице, снабжена схожим с предыдущими страница набор функций, которые позволяют вам: просмотреть информацию об исследовании, просмотреть снимки исследования и просмотреть прикрепленное вами описание.</w:t>
+      </w:r>
+    </w:p>
+    <w:p>
+      <w:pPr>
+        <w:jc w:val="both"/>
+        <w:rPr>
+          <w:sz w:val="28"/>
+          <w:szCs w:val="28"/>
+        </w:rPr>
+      </w:pPr>
+    </w:p>
+    <w:p>
+      <w:pPr>
+        <w:pStyle w:val="a3"/>
+        <w:numPr>
+          <w:ilvl w:val="1"/>
+          <w:numId w:val="3"/>
+        </w:numPr>
+        <w:jc w:val="both"/>
+        <w:rPr>
+          <w:b/>
+          <w:bCs/>
+          <w:sz w:val="28"/>
+          <w:szCs w:val="28"/>
+        </w:rPr>
+      </w:pPr>
+      <w:r>
+        <w:rPr>
+          <w:b/>
+          <w:bCs/>
+          <w:sz w:val="28"/>
+          <w:szCs w:val="28"/>
+        </w:rPr>
+        <w:t>Правила по времени</w:t>
+      </w:r>
+    </w:p>
+    <w:p>
+      <w:pPr>
+        <w:jc w:val="both"/>
+        <w:rPr>
+          <w:sz w:val="28"/>
+          <w:szCs w:val="28"/>
+        </w:rPr>
+      </w:pPr>
+      <w:r>
+        <w:rPr>
+          <w:sz w:val="28"/>
+          <w:szCs w:val="28"/>
+        </w:rPr>
+        <w:t xml:space="preserve">Общий вид данной странице приведен на рисунке 6. </w:t>
+      </w:r>
+    </w:p>
+    <w:p>
+      <w:pPr>
+        <w:jc w:val="both"/>
+        <w:rPr>
+          <w:sz w:val="28"/>
+          <w:szCs w:val="28"/>
+        </w:rPr>
+      </w:pPr>
+      <w:r>
+        <w:rPr>
+          <w:noProof/>
+          <w:sz w:val="28"/>
+          <w:szCs w:val="28"/>
+        </w:rPr>
+        <w:lastRenderedPageBreak/>
+        <w:drawing>
+          <wp:inline distT="0" distB="0" distL="0" distR="0" wp14:anchorId="7B0053F1" wp14:editId="537D9772">
+            <wp:extent cx="5934075" cy="2495550"/>
+            <wp:effectExtent l="0" t="0" r="0" b="0"/>
+            <wp:docPr id="5" name="Рисунок 5"/>
+            <wp:cNvGraphicFramePr>
+              <a:graphicFrameLocks xmlns:a="http://schemas.openxmlformats.org/drawingml/2006/main" noChangeAspect="1"/>
+            </wp:cNvGraphicFramePr>
+            <a:graphic xmlns:a="http://schemas.openxmlformats.org/drawingml/2006/main">
+              <a:graphicData uri="http://schemas.openxmlformats.org/drawingml/2006/picture">
+                <pic:pic xmlns:pic="http://schemas.openxmlformats.org/drawingml/2006/picture">
+                  <pic:nvPicPr>
+                    <pic:cNvPr id="0" name="Picture 4"/>
+                    <pic:cNvPicPr>
+                      <a:picLocks noChangeAspect="1" noChangeArrowheads="1"/>
+                    </pic:cNvPicPr>
+                  </pic:nvPicPr>
+                  <pic:blipFill>
+                    <a:blip r:embed="rId12">
+                      <a:extLst>
+                        <a:ext uri="{28A0092B-C50C-407E-A947-70E740481C1C}">
+                          <a14:useLocalDpi xmlns:a14="http://schemas.microsoft.com/office/drawing/2010/main" val="0"/>
+                        </a:ext>
+                      </a:extLst>
+                    </a:blip>
+                    <a:srcRect/>
+                    <a:stretch>
+                      <a:fillRect/>
+                    </a:stretch>
+                  </pic:blipFill>
+                  <pic:spPr bwMode="auto">
+                    <a:xfrm>
+                      <a:off x="0" y="0"/>
+                      <a:ext cx="5934075" cy="2495550"/>
+                    </a:xfrm>
+                    <a:prstGeom prst="rect">
+                      <a:avLst/>
+                    </a:prstGeom>
+                    <a:noFill/>
+                    <a:ln>
+                      <a:noFill/>
+                    </a:ln>
+                  </pic:spPr>
+                </pic:pic>
+              </a:graphicData>
+            </a:graphic>
+          </wp:inline>
+        </w:drawing>
+      </w:r>
+    </w:p>
+    <w:p>
+      <w:pPr>
+        <w:jc w:val="center"/>
+        <w:rPr>
+          <w:sz w:val="16"/>
+          <w:szCs w:val="16"/>
+        </w:rPr>
+      </w:pPr>
+      <w:r>
+        <w:rPr>
+          <w:sz w:val="16"/>
+          <w:szCs w:val="16"/>
+        </w:rPr>
+        <w:t>Рис.6 Страница «Правила по времени»</w:t>
+      </w:r>
+    </w:p>
+    <w:p>
+      <w:pPr>
+        <w:ind w:firstLine="708"/>
+        <w:jc w:val="both"/>
+        <w:rPr>
+          <w:sz w:val="28"/>
+          <w:szCs w:val="28"/>
+        </w:rPr>
+      </w:pPr>
+      <w:r>
+        <w:rPr>
+          <w:sz w:val="28"/>
+          <w:szCs w:val="28"/>
+        </w:rPr>
+        <w:t>Данная страница</w:t>
+      </w:r>
+      <w:r>
+        <w:rPr>
+          <w:sz w:val="28"/>
+          <w:szCs w:val="28"/>
+        </w:rPr>
+        <w:t>,</w:t>
+      </w:r>
+      <w:r>
+        <w:rPr>
+          <w:sz w:val="28"/>
+          <w:szCs w:val="28"/>
+        </w:rPr>
+        <w:t xml:space="preserve"> предоставляет доступ</w:t>
+      </w:r>
+      <w:r>
+        <w:rPr>
+          <w:sz w:val="28"/>
+          <w:szCs w:val="28"/>
+        </w:rPr>
+        <w:t>,</w:t>
+      </w:r>
+      <w:r>
+        <w:rPr>
+          <w:sz w:val="28"/>
+          <w:szCs w:val="28"/>
+        </w:rPr>
+        <w:t xml:space="preserve"> к механизму</w:t>
+      </w:r>
+      <w:r>
+        <w:rPr>
+          <w:sz w:val="28"/>
+          <w:szCs w:val="28"/>
+        </w:rPr>
+        <w:t xml:space="preserve"> автоматизации отправки поступающих на сервер заданий, в группы удаленных пользователей. Пользователю доступно создание, редактирование и удаление правил. При создании правил, обратите внимание, что правила применяются по старшинству сверху вниз. При этом, для каждого исследования, может быть применено только одно правило, таким образом к исследованию будет применено первое подходящее по условиям правило, а все правила</w:t>
+      </w:r>
+      <w:r>
+        <w:rPr>
+          <w:sz w:val="28"/>
+          <w:szCs w:val="28"/>
+        </w:rPr>
+        <w:t>,</w:t>
+      </w:r>
+      <w:r>
+        <w:rPr>
+          <w:sz w:val="28"/>
+          <w:szCs w:val="28"/>
+        </w:rPr>
+        <w:t xml:space="preserve"> расположенные ниже, будут отброшены. </w:t>
+      </w:r>
+    </w:p>
+    <w:p>
+      <w:pPr>
+        <w:ind w:firstLine="708"/>
+        <w:jc w:val="both"/>
+        <w:rPr>
+          <w:sz w:val="28"/>
+          <w:szCs w:val="28"/>
+        </w:rPr>
+      </w:pPr>
+      <w:r>
+        <w:rPr>
+          <w:sz w:val="28"/>
+          <w:szCs w:val="28"/>
+        </w:rPr>
+        <w:t xml:space="preserve">Рассмотрим для примера случай, изображенный на рисунке 6, в данной таблице указаны два правила, первое правило читается как: модальности </w:t>
+      </w:r>
+      <w:r>
+        <w:rPr>
+          <w:sz w:val="28"/>
+          <w:szCs w:val="28"/>
+          <w:lang w:val="en-US"/>
+        </w:rPr>
+        <w:t>MR</w:t>
+      </w:r>
+      <w:r>
+        <w:rPr>
+          <w:sz w:val="28"/>
+          <w:szCs w:val="28"/>
+        </w:rPr>
+        <w:t>,</w:t>
+      </w:r>
+      <w:r>
+        <w:rPr>
+          <w:sz w:val="28"/>
+          <w:szCs w:val="28"/>
+        </w:rPr>
+        <w:t xml:space="preserve"> </w:t>
+      </w:r>
+      <w:r>
+        <w:rPr>
+          <w:sz w:val="28"/>
+          <w:szCs w:val="28"/>
+        </w:rPr>
+        <w:t>пришедшие из источника «</w:t>
+      </w:r>
+      <w:r>
+        <w:rPr>
+          <w:sz w:val="28"/>
+          <w:szCs w:val="28"/>
+          <w:lang w:val="en-US"/>
+        </w:rPr>
+        <w:t>Chita</w:t>
+      </w:r>
+      <w:r>
+        <w:rPr>
+          <w:sz w:val="28"/>
+          <w:szCs w:val="28"/>
+        </w:rPr>
+        <w:t>»</w:t>
+      </w:r>
+      <w:r>
+        <w:rPr>
+          <w:sz w:val="28"/>
+          <w:szCs w:val="28"/>
+        </w:rPr>
+        <w:t xml:space="preserve"> </w:t>
+      </w:r>
+      <w:r>
+        <w:rPr>
+          <w:sz w:val="28"/>
+          <w:szCs w:val="28"/>
+        </w:rPr>
+        <w:t>после 15</w:t>
+      </w:r>
+      <w:r>
+        <w:rPr>
+          <w:sz w:val="28"/>
+          <w:szCs w:val="28"/>
+        </w:rPr>
+        <w:t>:00</w:t>
+      </w:r>
+      <w:r>
+        <w:rPr>
+          <w:sz w:val="28"/>
+          <w:szCs w:val="28"/>
+        </w:rPr>
+        <w:t xml:space="preserve">, отправлять на описание в группу «Демо группа». Второе правило следует читать как: все исследования из всех источников, после 15:00 отправлять на описание в группу «Демо 2». </w:t>
+      </w:r>
+    </w:p>
+    <w:p>
+      <w:pPr>
+        <w:ind w:firstLine="708"/>
+        <w:jc w:val="both"/>
+        <w:rPr>
+          <w:sz w:val="28"/>
+          <w:szCs w:val="28"/>
+        </w:rPr>
+      </w:pPr>
+      <w:r>
+        <w:rPr>
+          <w:sz w:val="28"/>
+          <w:szCs w:val="28"/>
+        </w:rPr>
+        <w:t xml:space="preserve">Таким образом, учитывая сказанное ранее про механизм применения правил, можно заключить, что после 15:00 все исследования, кроме </w:t>
+      </w:r>
+      <w:r>
+        <w:rPr>
+          <w:sz w:val="28"/>
+          <w:szCs w:val="28"/>
+          <w:lang w:val="en-US"/>
+        </w:rPr>
+        <w:t>MR</w:t>
+      </w:r>
+      <w:r>
+        <w:rPr>
+          <w:sz w:val="28"/>
+          <w:szCs w:val="28"/>
+        </w:rPr>
+        <w:t xml:space="preserve"> от источника «</w:t>
+      </w:r>
+      <w:r>
+        <w:rPr>
+          <w:sz w:val="28"/>
+          <w:szCs w:val="28"/>
+          <w:lang w:val="en-US"/>
+        </w:rPr>
+        <w:t>Chita</w:t>
+      </w:r>
+      <w:r>
+        <w:rPr>
+          <w:sz w:val="28"/>
+          <w:szCs w:val="28"/>
+        </w:rPr>
+        <w:t>», будут направлены на описание в группу «Демо</w:t>
+      </w:r>
+      <w:r>
+        <w:rPr>
+          <w:sz w:val="28"/>
+          <w:szCs w:val="28"/>
+        </w:rPr>
+        <w:t xml:space="preserve"> </w:t>
+      </w:r>
+      <w:r>
+        <w:rPr>
+          <w:sz w:val="28"/>
+          <w:szCs w:val="28"/>
+        </w:rPr>
+        <w:t xml:space="preserve">2», а исследования </w:t>
+      </w:r>
+      <w:r>
+        <w:rPr>
+          <w:sz w:val="28"/>
+          <w:szCs w:val="28"/>
+          <w:lang w:val="en-US"/>
+        </w:rPr>
+        <w:t>MR</w:t>
+      </w:r>
+      <w:r>
+        <w:rPr>
+          <w:sz w:val="28"/>
+          <w:szCs w:val="28"/>
+        </w:rPr>
+        <w:t xml:space="preserve"> </w:t>
+      </w:r>
+      <w:r>
+        <w:rPr>
+          <w:sz w:val="28"/>
+          <w:szCs w:val="28"/>
+        </w:rPr>
+        <w:t xml:space="preserve">из </w:t>
+      </w:r>
+      <w:proofErr w:type="gramStart"/>
+      <w:r>
+        <w:rPr>
+          <w:sz w:val="28"/>
+          <w:szCs w:val="28"/>
+        </w:rPr>
+        <w:t>источника  «</w:t>
+      </w:r>
+      <w:proofErr w:type="gramEnd"/>
+      <w:r>
+        <w:rPr>
+          <w:sz w:val="28"/>
+          <w:szCs w:val="28"/>
+          <w:lang w:val="en-US"/>
+        </w:rPr>
+        <w:t>Chita</w:t>
+      </w:r>
+      <w:r>
+        <w:rPr>
+          <w:sz w:val="28"/>
+          <w:szCs w:val="28"/>
+        </w:rPr>
+        <w:t xml:space="preserve">», будут направлены в группу «Демо группа». То есть, как мы и сказали ранее, для </w:t>
+      </w:r>
+      <w:r>
+        <w:rPr>
+          <w:sz w:val="28"/>
+          <w:szCs w:val="28"/>
+        </w:rPr>
+        <w:t xml:space="preserve">модальности </w:t>
+      </w:r>
+      <w:r>
+        <w:rPr>
+          <w:sz w:val="28"/>
+          <w:szCs w:val="28"/>
+          <w:lang w:val="en-US"/>
+        </w:rPr>
+        <w:t>MR</w:t>
+      </w:r>
+      <w:r>
+        <w:rPr>
+          <w:sz w:val="28"/>
+          <w:szCs w:val="28"/>
+        </w:rPr>
+        <w:t xml:space="preserve"> </w:t>
+      </w:r>
+      <w:r>
+        <w:rPr>
+          <w:sz w:val="28"/>
+          <w:szCs w:val="28"/>
+        </w:rPr>
+        <w:t xml:space="preserve">из </w:t>
+      </w:r>
+      <w:proofErr w:type="gramStart"/>
+      <w:r>
+        <w:rPr>
+          <w:sz w:val="28"/>
+          <w:szCs w:val="28"/>
+        </w:rPr>
+        <w:t>источника  «</w:t>
+      </w:r>
+      <w:proofErr w:type="gramEnd"/>
+      <w:r>
+        <w:rPr>
+          <w:sz w:val="28"/>
+          <w:szCs w:val="28"/>
+          <w:lang w:val="en-US"/>
+        </w:rPr>
+        <w:t>Chita</w:t>
+      </w:r>
+      <w:r>
+        <w:rPr>
+          <w:sz w:val="28"/>
+          <w:szCs w:val="28"/>
+        </w:rPr>
+        <w:t>»</w:t>
+      </w:r>
+      <w:r>
+        <w:rPr>
+          <w:sz w:val="28"/>
+          <w:szCs w:val="28"/>
+        </w:rPr>
+        <w:t xml:space="preserve">, второе правило отбрасывается. </w:t>
+      </w:r>
+    </w:p>
+    <w:p>
+      <w:pPr>
+        <w:ind w:firstLine="708"/>
+        <w:jc w:val="both"/>
+        <w:rPr>
+          <w:sz w:val="28"/>
+          <w:szCs w:val="28"/>
+        </w:rPr>
+      </w:pPr>
+      <w:r>
+        <w:rPr>
+          <w:sz w:val="28"/>
+          <w:szCs w:val="28"/>
+        </w:rPr>
+        <w:t xml:space="preserve">Данный механизм реализован, для исключения ситуации отправки задания в несколько групп сразу. Так же, обратите внимание, что под термином «Источник» исследования, в данной ситуации, понимается идентификатор, указанный в соответствующем тэге </w:t>
+      </w:r>
+      <w:proofErr w:type="gramStart"/>
+      <w:r>
+        <w:rPr>
+          <w:sz w:val="28"/>
+          <w:szCs w:val="28"/>
+          <w:lang w:val="en-US"/>
+        </w:rPr>
+        <w:t>DICOM</w:t>
+      </w:r>
+      <w:r>
+        <w:rPr>
+          <w:sz w:val="28"/>
+          <w:szCs w:val="28"/>
+        </w:rPr>
+        <w:t>-снимков</w:t>
+      </w:r>
+      <w:proofErr w:type="gramEnd"/>
+      <w:r>
+        <w:rPr>
+          <w:sz w:val="28"/>
+          <w:szCs w:val="28"/>
+        </w:rPr>
+        <w:t xml:space="preserve"> поступающих на сервер, заполнение данного тэга производится на </w:t>
+      </w:r>
+      <w:r>
+        <w:rPr>
+          <w:sz w:val="28"/>
+          <w:szCs w:val="28"/>
+        </w:rPr>
+        <w:lastRenderedPageBreak/>
+        <w:t xml:space="preserve">оборудовании, которое отправляет снимки на сервер и требует отдельной настройки, для корректного отображения. Список источников, программа берет из уже имеющихся на сервере исследований, перечитывая все изображения и выделяя уникальные источники.  </w:t>
+      </w:r>
+      <w:r>
+        <w:rPr>
+          <w:sz w:val="28"/>
+          <w:szCs w:val="28"/>
+        </w:rPr>
+        <w:t xml:space="preserve"> </w:t>
+      </w:r>
+    </w:p>
+    <w:p>
+      <w:pPr>
+        <w:ind w:firstLine="708"/>
+        <w:jc w:val="both"/>
+        <w:rPr>
+          <w:sz w:val="28"/>
+          <w:szCs w:val="28"/>
+        </w:rPr>
+      </w:pPr>
+      <w:r>
+        <w:rPr>
+          <w:sz w:val="28"/>
+          <w:szCs w:val="28"/>
+        </w:rPr>
+        <w:t xml:space="preserve">Мы рассмотрели все рабочие механизмы пользователя с ролью «Локальный пользователь». В окончании, можно под итожить, что данная роль позволяет просматривать персональные данные пациентов, исследования которых попали на сервер, блокировать исследования для описания, прикреплять к исследованиям результаты и отправлять исследования на описание другим пользователей (группам пользователей). </w:t>
+      </w:r>
+    </w:p>
+    <w:p>
+      <w:pPr>
+        <w:ind w:firstLine="708"/>
+        <w:jc w:val="both"/>
+        <w:rPr>
+          <w:sz w:val="28"/>
+          <w:szCs w:val="28"/>
+        </w:rPr>
+      </w:pPr>
+    </w:p>
+    <w:p>
+      <w:pPr>
+        <w:pStyle w:val="a3"/>
+        <w:numPr>
+          <w:ilvl w:val="0"/>
+          <w:numId w:val="3"/>
+        </w:numPr>
+        <w:jc w:val="both"/>
+        <w:rPr>
+          <w:b/>
+          <w:bCs/>
+          <w:sz w:val="28"/>
+          <w:szCs w:val="28"/>
+        </w:rPr>
+      </w:pPr>
+      <w:r>
+        <w:rPr>
+          <w:b/>
+          <w:bCs/>
+          <w:sz w:val="28"/>
+          <w:szCs w:val="28"/>
+        </w:rPr>
+        <w:t>Домашняя страница «Удаленный пользователь»</w:t>
+      </w:r>
+    </w:p>
+    <w:p>
+      <w:pPr>
+        <w:ind w:firstLine="360"/>
+        <w:jc w:val="both"/>
+        <w:rPr>
+          <w:sz w:val="28"/>
+          <w:szCs w:val="28"/>
+        </w:rPr>
+      </w:pPr>
+      <w:r>
+        <w:rPr>
+          <w:sz w:val="28"/>
+          <w:szCs w:val="28"/>
+        </w:rPr>
+        <w:t>Функционал удаленного пользователя, предполагает отсутствие доступа к персональным данным, в остальном, все доступные этой категории пользователей страницы, очень похожи на страницы локального пользователя. На домашней странице, удаленному пользователю, доступны следующие ссылки:</w:t>
+      </w:r>
+    </w:p>
+    <w:p>
+      <w:pPr>
+        <w:pStyle w:val="a3"/>
+        <w:numPr>
+          <w:ilvl w:val="1"/>
+          <w:numId w:val="3"/>
+        </w:numPr>
+        <w:jc w:val="both"/>
+        <w:rPr>
+          <w:b/>
+          <w:bCs/>
+          <w:sz w:val="28"/>
+          <w:szCs w:val="28"/>
+        </w:rPr>
+      </w:pPr>
+      <w:r>
+        <w:rPr>
+          <w:b/>
+          <w:bCs/>
+          <w:sz w:val="28"/>
+          <w:szCs w:val="28"/>
+        </w:rPr>
+        <w:t>Очередь на описание</w:t>
+      </w:r>
+    </w:p>
+    <w:p>
+      <w:pPr>
+        <w:ind w:firstLine="708"/>
+        <w:jc w:val="both"/>
+        <w:rPr>
+          <w:sz w:val="28"/>
+          <w:szCs w:val="28"/>
+        </w:rPr>
+      </w:pPr>
+      <w:r>
+        <w:rPr>
+          <w:sz w:val="28"/>
+          <w:szCs w:val="28"/>
+        </w:rPr>
+        <w:t>Н</w:t>
+      </w:r>
+      <w:r>
+        <w:rPr>
+          <w:sz w:val="28"/>
+          <w:szCs w:val="28"/>
+        </w:rPr>
+        <w:t>а этой странице, представлена таблица</w:t>
+      </w:r>
+      <w:r>
+        <w:rPr>
+          <w:sz w:val="28"/>
+          <w:szCs w:val="28"/>
+        </w:rPr>
+        <w:t xml:space="preserve"> </w:t>
+      </w:r>
+      <w:r>
+        <w:rPr>
+          <w:sz w:val="28"/>
+          <w:szCs w:val="28"/>
+        </w:rPr>
+        <w:t xml:space="preserve">исследований, отправленных на описание в вашу группу. В строке каждого исследования, есть несколько пиктограмм, которые являются основными инструментами работы с исследованием. </w:t>
+      </w:r>
+    </w:p>
+    <w:p>
+      <w:pPr>
+        <w:ind w:firstLine="708"/>
+        <w:jc w:val="both"/>
+        <w:rPr>
+          <w:sz w:val="28"/>
+          <w:szCs w:val="28"/>
+        </w:rPr>
+      </w:pPr>
+      <w:r>
+        <w:rPr>
+          <w:b/>
+          <w:bCs/>
+          <w:sz w:val="28"/>
+          <w:szCs w:val="28"/>
+        </w:rPr>
+        <w:t>Анамнез</w:t>
+      </w:r>
+      <w:r>
+        <w:rPr>
+          <w:sz w:val="28"/>
+          <w:szCs w:val="28"/>
+        </w:rPr>
+        <w:t xml:space="preserve"> – открывает окно анамнеза пациента, доступное </w:t>
+      </w:r>
+      <w:r>
+        <w:rPr>
+          <w:sz w:val="28"/>
+          <w:szCs w:val="28"/>
+        </w:rPr>
+        <w:t>только для просмотра.</w:t>
+      </w:r>
+    </w:p>
+    <w:p>
+      <w:pPr>
+        <w:ind w:firstLine="708"/>
+        <w:jc w:val="both"/>
+        <w:rPr>
+          <w:sz w:val="28"/>
+          <w:szCs w:val="28"/>
+        </w:rPr>
+      </w:pPr>
+      <w:r>
+        <w:rPr>
+          <w:sz w:val="28"/>
+          <w:szCs w:val="28"/>
+        </w:rPr>
+        <w:t xml:space="preserve"> </w:t>
+      </w:r>
+      <w:r>
+        <w:rPr>
+          <w:b/>
+          <w:bCs/>
+          <w:sz w:val="28"/>
+          <w:szCs w:val="28"/>
+        </w:rPr>
+        <w:t xml:space="preserve">Открыть в </w:t>
+      </w:r>
+      <w:r>
+        <w:rPr>
+          <w:b/>
+          <w:bCs/>
+          <w:sz w:val="28"/>
+          <w:szCs w:val="28"/>
+          <w:lang w:val="en-US"/>
+        </w:rPr>
+        <w:t>O</w:t>
+      </w:r>
+      <w:r>
+        <w:rPr>
+          <w:b/>
+          <w:bCs/>
+          <w:sz w:val="28"/>
+          <w:szCs w:val="28"/>
+          <w:lang w:val="en-US"/>
+        </w:rPr>
+        <w:t>SIMIS</w:t>
+      </w:r>
+      <w:r>
+        <w:rPr>
+          <w:sz w:val="28"/>
+          <w:szCs w:val="28"/>
+        </w:rPr>
+        <w:t xml:space="preserve"> – </w:t>
+      </w:r>
+      <w:r>
+        <w:rPr>
+          <w:sz w:val="28"/>
+          <w:szCs w:val="28"/>
+        </w:rPr>
+        <w:t xml:space="preserve">открывает на новой странице, просмотрщик </w:t>
+      </w:r>
+      <w:r>
+        <w:rPr>
+          <w:sz w:val="28"/>
+          <w:szCs w:val="28"/>
+          <w:lang w:val="en-US"/>
+        </w:rPr>
+        <w:t>DICOM</w:t>
+      </w:r>
+      <w:r>
+        <w:rPr>
+          <w:sz w:val="28"/>
+          <w:szCs w:val="28"/>
+        </w:rPr>
+        <w:t>-снимков</w:t>
+      </w:r>
+      <w:r>
+        <w:rPr>
+          <w:sz w:val="28"/>
+          <w:szCs w:val="28"/>
+        </w:rPr>
+        <w:t xml:space="preserve"> </w:t>
+      </w:r>
+      <w:r>
+        <w:rPr>
+          <w:sz w:val="28"/>
+          <w:szCs w:val="28"/>
+        </w:rPr>
+        <w:t>с данным исследованием.</w:t>
+      </w:r>
+    </w:p>
+    <w:p>
+      <w:pPr>
+        <w:ind w:firstLine="708"/>
+        <w:jc w:val="both"/>
+        <w:rPr>
+          <w:sz w:val="28"/>
+          <w:szCs w:val="28"/>
+        </w:rPr>
+      </w:pPr>
+      <w:r>
+        <w:rPr>
+          <w:b/>
+          <w:bCs/>
+          <w:sz w:val="28"/>
+          <w:szCs w:val="28"/>
+        </w:rPr>
+        <w:t>Взять на описание</w:t>
+      </w:r>
+      <w:r>
+        <w:rPr>
+          <w:sz w:val="28"/>
+          <w:szCs w:val="28"/>
+        </w:rPr>
+        <w:t xml:space="preserve"> - </w:t>
+      </w:r>
+      <w:r>
+        <w:rPr>
+          <w:sz w:val="28"/>
+          <w:szCs w:val="28"/>
+        </w:rPr>
+        <w:t>с помощью данной кнопки, можно взять исследование на описание. Исследование при этом,</w:t>
+      </w:r>
+      <w:r>
+        <w:rPr>
+          <w:sz w:val="28"/>
+          <w:szCs w:val="28"/>
+        </w:rPr>
+        <w:t xml:space="preserve"> будет заблокировано и не доступно для анализа другим пользователям</w:t>
+      </w:r>
+      <w:r>
+        <w:rPr>
+          <w:sz w:val="28"/>
+          <w:szCs w:val="28"/>
+        </w:rPr>
+        <w:t>,</w:t>
+      </w:r>
+      <w:r>
+        <w:rPr>
+          <w:sz w:val="28"/>
+          <w:szCs w:val="28"/>
+        </w:rPr>
+        <w:t xml:space="preserve"> </w:t>
+      </w:r>
+      <w:r>
+        <w:rPr>
+          <w:sz w:val="28"/>
+          <w:szCs w:val="28"/>
+        </w:rPr>
+        <w:t>а</w:t>
+      </w:r>
+      <w:r>
+        <w:rPr>
+          <w:sz w:val="28"/>
+          <w:szCs w:val="28"/>
+        </w:rPr>
+        <w:t xml:space="preserve"> не сможете приступить к другим исследованиям пока не опишите это. Срок</w:t>
+      </w:r>
+      <w:r>
+        <w:rPr>
+          <w:sz w:val="28"/>
+          <w:szCs w:val="28"/>
+        </w:rPr>
+        <w:t>,</w:t>
+      </w:r>
+      <w:r>
+        <w:rPr>
+          <w:sz w:val="28"/>
+          <w:szCs w:val="28"/>
+        </w:rPr>
+        <w:t xml:space="preserve"> </w:t>
+      </w:r>
+      <w:r>
+        <w:rPr>
+          <w:sz w:val="28"/>
+          <w:szCs w:val="28"/>
+        </w:rPr>
+        <w:t>на который можно заблокировать исследование, определяется администратором, по умолчанию 24 часа</w:t>
+      </w:r>
+      <w:r>
+        <w:rPr>
+          <w:sz w:val="28"/>
+          <w:szCs w:val="28"/>
+        </w:rPr>
+        <w:t>. После истечения этого срока, исследование будет автоматически разблокировано и станет доступно для просмотра другим пользователям!</w:t>
+      </w:r>
+    </w:p>
+    <w:p>
+      <w:pPr>
+        <w:pStyle w:val="a3"/>
+        <w:numPr>
+          <w:ilvl w:val="1"/>
+          <w:numId w:val="3"/>
+        </w:numPr>
+        <w:jc w:val="both"/>
+        <w:rPr>
+          <w:b/>
+          <w:bCs/>
+          <w:sz w:val="28"/>
+          <w:szCs w:val="28"/>
+        </w:rPr>
+      </w:pPr>
+      <w:r>
+        <w:rPr>
+          <w:b/>
+          <w:bCs/>
+          <w:sz w:val="28"/>
+          <w:szCs w:val="28"/>
+        </w:rPr>
+        <w:lastRenderedPageBreak/>
+        <w:t>Текущее задание</w:t>
+      </w:r>
+    </w:p>
+    <w:p>
+      <w:pPr>
+        <w:ind w:firstLine="708"/>
+        <w:jc w:val="both"/>
+        <w:rPr>
+          <w:sz w:val="28"/>
+          <w:szCs w:val="28"/>
+        </w:rPr>
+      </w:pPr>
+      <w:r>
+        <w:rPr>
+          <w:sz w:val="28"/>
+          <w:szCs w:val="28"/>
+        </w:rPr>
+        <w:t>На этой странице отображено текущее заблокированное пользователем исследование, есть возможность просмотреть анамнез, снимки и прикрепить файл описание, после чего статус исследования изменится на «Описан».</w:t>
+      </w:r>
+    </w:p>
+    <w:p>
+      <w:pPr>
+        <w:pStyle w:val="a3"/>
+        <w:numPr>
+          <w:ilvl w:val="1"/>
+          <w:numId w:val="3"/>
+        </w:numPr>
+        <w:jc w:val="both"/>
+        <w:rPr>
+          <w:b/>
+          <w:bCs/>
+          <w:sz w:val="28"/>
+          <w:szCs w:val="28"/>
+        </w:rPr>
+      </w:pPr>
+      <w:r>
+        <w:rPr>
+          <w:b/>
+          <w:bCs/>
+          <w:sz w:val="28"/>
+          <w:szCs w:val="28"/>
+        </w:rPr>
+        <w:t xml:space="preserve">Мои описания  </w:t>
+      </w:r>
+    </w:p>
+    <w:p>
+      <w:pPr>
+        <w:ind w:firstLine="708"/>
+        <w:jc w:val="both"/>
+        <w:rPr>
+          <w:sz w:val="28"/>
+          <w:szCs w:val="28"/>
+        </w:rPr>
+      </w:pPr>
+      <w:r>
+        <w:rPr>
+          <w:sz w:val="28"/>
+          <w:szCs w:val="28"/>
+        </w:rPr>
+        <w:t>На этой странице, пользователь может просмотреть все сделанные им описания</w:t>
+      </w:r>
+      <w:r>
+        <w:rPr>
+          <w:sz w:val="28"/>
+          <w:szCs w:val="28"/>
+        </w:rPr>
+        <w:t>, однако снимки исследования, после описания больше не доступны для просмотра, так как для экономии места на сервере, все анонимные данные, удаляются сразу после изменения статуса исследования.</w:t>
+      </w:r>
+    </w:p>
+    <w:p>
+      <w:pPr>
+        <w:jc w:val="both"/>
+        <w:rPr>
+          <w:sz w:val="28"/>
+          <w:szCs w:val="28"/>
+        </w:rPr>
+      </w:pPr>
+    </w:p>
+    <w:p>
+      <w:pPr>
+        <w:pStyle w:val="a3"/>
+        <w:numPr>
+          <w:ilvl w:val="0"/>
+          <w:numId w:val="3"/>
+        </w:numPr>
+        <w:jc w:val="both"/>
+        <w:rPr>
+          <w:b/>
+          <w:bCs/>
+          <w:sz w:val="28"/>
+          <w:szCs w:val="28"/>
+        </w:rPr>
+      </w:pPr>
+      <w:r>
+        <w:rPr>
+          <w:b/>
+          <w:bCs/>
+          <w:sz w:val="28"/>
+          <w:szCs w:val="28"/>
+        </w:rPr>
+        <w:t>Домашняя страница «</w:t>
+      </w:r>
+      <w:r>
+        <w:rPr>
+          <w:b/>
+          <w:bCs/>
+          <w:sz w:val="28"/>
+          <w:szCs w:val="28"/>
+        </w:rPr>
+        <w:t>Локальный только просмотр</w:t>
+      </w:r>
+      <w:r>
+        <w:rPr>
+          <w:b/>
+          <w:bCs/>
+          <w:sz w:val="28"/>
+          <w:szCs w:val="28"/>
+        </w:rPr>
+        <w:t>»</w:t>
+      </w:r>
+    </w:p>
+    <w:p>
+      <w:pPr>
+        <w:ind w:firstLine="360"/>
+        <w:jc w:val="both"/>
+        <w:rPr>
+          <w:sz w:val="28"/>
+          <w:szCs w:val="28"/>
+        </w:rPr>
+      </w:pPr>
+      <w:r>
+        <w:rPr>
+          <w:sz w:val="28"/>
+          <w:szCs w:val="28"/>
+        </w:rPr>
+        <w:t xml:space="preserve">В данной роли, доступна только страница «Очередь» аналогичная локальному пользователю, только </w:t>
+      </w:r>
+      <w:r>
+        <w:rPr>
+          <w:sz w:val="28"/>
+          <w:szCs w:val="28"/>
+        </w:rPr>
+        <w:t xml:space="preserve">функция «Взять на описание исследование» </w:t>
+      </w:r>
+      <w:r>
+        <w:rPr>
+          <w:sz w:val="28"/>
+          <w:szCs w:val="28"/>
+        </w:rPr>
+        <w:t>-</w:t>
+      </w:r>
+      <w:r>
+        <w:rPr>
+          <w:sz w:val="28"/>
+          <w:szCs w:val="28"/>
+        </w:rPr>
+        <w:t xml:space="preserve"> не активна, так как роль предназначена для врачей не рентгенологического профиля, прос</w:t>
+      </w:r>
+      <w:r>
+        <w:rPr>
+          <w:sz w:val="28"/>
+          <w:szCs w:val="28"/>
+        </w:rPr>
+        <w:t>матривающих снимки и результаты описаний.</w:t>
+      </w:r>
+    </w:p>
+    <w:p>
+      <w:pPr>
+        <w:ind w:firstLine="360"/>
+        <w:jc w:val="both"/>
+        <w:rPr>
+          <w:sz w:val="28"/>
+          <w:szCs w:val="28"/>
+        </w:rPr>
+      </w:pPr>
+    </w:p>
+    <w:p>
+      <w:pPr>
+        <w:pStyle w:val="a3"/>
+        <w:numPr>
+          <w:ilvl w:val="0"/>
+          <w:numId w:val="3"/>
+        </w:numPr>
+        <w:jc w:val="both"/>
+        <w:rPr>
+          <w:b/>
+          <w:bCs/>
+          <w:sz w:val="28"/>
+          <w:szCs w:val="28"/>
+        </w:rPr>
+      </w:pPr>
+      <w:r>
+        <w:rPr>
+          <w:b/>
+          <w:bCs/>
+          <w:sz w:val="28"/>
+          <w:szCs w:val="28"/>
+        </w:rPr>
+        <w:t>Домашняя страница «Администратор»</w:t>
+      </w:r>
+    </w:p>
+    <w:p>
+      <w:pPr>
+        <w:ind w:firstLine="360"/>
+        <w:jc w:val="both"/>
+        <w:rPr>
+          <w:sz w:val="28"/>
+          <w:szCs w:val="28"/>
+        </w:rPr>
+      </w:pPr>
+      <w:r>
+        <w:rPr>
+          <w:sz w:val="28"/>
+          <w:szCs w:val="28"/>
+        </w:rPr>
+        <w:t xml:space="preserve">Данная роль, предназначена для </w:t>
+      </w:r>
+      <w:r>
+        <w:rPr>
+          <w:sz w:val="28"/>
+          <w:szCs w:val="28"/>
+          <w:lang w:val="en-US"/>
+        </w:rPr>
+        <w:t>it</w:t>
+      </w:r>
+      <w:r>
+        <w:rPr>
+          <w:sz w:val="28"/>
+          <w:szCs w:val="28"/>
+        </w:rPr>
+        <w:t>-специалистов, системных-администраторов предприятия, и позволяет управлять этим сервером.</w:t>
+      </w:r>
+    </w:p>
+    <w:p>
+      <w:pPr>
+        <w:pStyle w:val="a3"/>
+        <w:numPr>
+          <w:ilvl w:val="1"/>
+          <w:numId w:val="3"/>
+        </w:numPr>
+        <w:jc w:val="both"/>
+        <w:rPr>
+          <w:b/>
+          <w:bCs/>
+          <w:sz w:val="28"/>
+          <w:szCs w:val="28"/>
+        </w:rPr>
+      </w:pPr>
+      <w:proofErr w:type="spellStart"/>
+      <w:r>
+        <w:rPr>
+          <w:b/>
+          <w:bCs/>
+          <w:sz w:val="28"/>
+          <w:szCs w:val="28"/>
+        </w:rPr>
+        <w:t>Orthanc</w:t>
+      </w:r>
+      <w:proofErr w:type="spellEnd"/>
+      <w:r>
+        <w:rPr>
+          <w:b/>
+          <w:bCs/>
+          <w:sz w:val="28"/>
+          <w:szCs w:val="28"/>
+        </w:rPr>
+        <w:t xml:space="preserve"> настройки</w:t>
+      </w:r>
+    </w:p>
+    <w:p>
+      <w:pPr>
+        <w:ind w:firstLine="708"/>
+        <w:jc w:val="both"/>
+        <w:rPr>
+          <w:sz w:val="28"/>
+          <w:szCs w:val="28"/>
+        </w:rPr>
+      </w:pPr>
+      <w:r>
+        <w:rPr>
+          <w:sz w:val="28"/>
+          <w:szCs w:val="28"/>
+        </w:rPr>
+        <w:t xml:space="preserve">На данной странице производится настройка </w:t>
+      </w:r>
+      <w:r>
+        <w:rPr>
+          <w:sz w:val="28"/>
+          <w:szCs w:val="28"/>
+          <w:lang w:val="en-US"/>
+        </w:rPr>
+        <w:t>DICOM</w:t>
+      </w:r>
+      <w:r>
+        <w:rPr>
+          <w:sz w:val="28"/>
+          <w:szCs w:val="28"/>
+        </w:rPr>
+        <w:t xml:space="preserve">-Сервера </w:t>
+      </w:r>
+      <w:proofErr w:type="spellStart"/>
+      <w:r>
+        <w:rPr>
+          <w:sz w:val="28"/>
+          <w:szCs w:val="28"/>
+          <w:lang w:val="en-US"/>
+        </w:rPr>
+        <w:t>Orthanc</w:t>
+      </w:r>
+      <w:proofErr w:type="spellEnd"/>
+      <w:r>
+        <w:rPr>
+          <w:sz w:val="28"/>
+          <w:szCs w:val="28"/>
+        </w:rPr>
+        <w:t>. Большинство представленных здесь параметров не требуют изменений, конечным пользователем и нами описываться не будут. Рассмотрим подробнее только те параметры</w:t>
+      </w:r>
+      <w:r>
+        <w:rPr>
+          <w:sz w:val="28"/>
+          <w:szCs w:val="28"/>
+        </w:rPr>
+        <w:t>,</w:t>
+      </w:r>
+      <w:r>
+        <w:rPr>
+          <w:sz w:val="28"/>
+          <w:szCs w:val="28"/>
+        </w:rPr>
+        <w:t xml:space="preserve"> которые необходимо будет изменять во время эксплуатации сервера.</w:t>
+      </w:r>
+    </w:p>
+    <w:p>
+      <w:pPr>
+        <w:ind w:firstLine="708"/>
+        <w:jc w:val="both"/>
+        <w:rPr>
+          <w:b/>
+          <w:bCs/>
+          <w:sz w:val="28"/>
+          <w:szCs w:val="28"/>
+        </w:rPr>
+      </w:pPr>
+      <w:r>
+        <w:rPr>
+          <w:b/>
+          <w:bCs/>
+          <w:sz w:val="28"/>
+          <w:szCs w:val="28"/>
+        </w:rPr>
+        <w:t>Вкладка «Топология сети» пункт «</w:t>
+      </w:r>
+      <w:r>
+        <w:rPr>
+          <w:b/>
+          <w:bCs/>
+          <w:sz w:val="28"/>
+          <w:szCs w:val="28"/>
+          <w:lang w:val="en-US"/>
+        </w:rPr>
+        <w:t>DICOM</w:t>
+      </w:r>
+      <w:r>
+        <w:rPr>
+          <w:b/>
+          <w:bCs/>
+          <w:sz w:val="28"/>
+          <w:szCs w:val="28"/>
+        </w:rPr>
+        <w:t xml:space="preserve"> Модальности»</w:t>
+      </w:r>
+    </w:p>
+    <w:p>
+      <w:pPr>
+        <w:pStyle w:val="a3"/>
+        <w:ind w:left="360"/>
+        <w:jc w:val="both"/>
+        <w:rPr>
+          <w:sz w:val="28"/>
+          <w:szCs w:val="28"/>
+        </w:rPr>
+      </w:pPr>
+    </w:p>
+    <w:p>
+      <w:pPr>
+        <w:ind w:firstLine="360"/>
+        <w:jc w:val="both"/>
+        <w:rPr>
+          <w:sz w:val="28"/>
+          <w:szCs w:val="28"/>
+        </w:rPr>
+      </w:pPr>
+    </w:p>
+    <w:p>
+      <w:pPr>
+        <w:jc w:val="both"/>
+        <w:rPr>
+          <w:sz w:val="28"/>
+          <w:szCs w:val="28"/>
+        </w:rPr>
+      </w:pPr>
+    </w:p>
+    <w:p>
+      <w:pPr>
+        <w:jc w:val="both"/>
+        <w:rPr>
+          <w:b/>
+          <w:bCs/>
           <w:sz w:val="28"/>
           <w:szCs w:val="28"/>
         </w:rPr>
@@ -2422,7 +4455,7 @@
       </w:pPr>
     </w:p>
     <w:sectPr>
-      <w:footerReference w:type="default" r:id="rId10"/>
+      <w:footerReference w:type="default" r:id="rId13"/>
       <w:pgSz w:w="11906" w:h="16838"/>
       <w:pgMar w:top="1134" w:right="850" w:bottom="1134" w:left="1701" w:header="708" w:footer="708" w:gutter="0"/>
       <w:cols w:space="708"/>
@@ -2467,6 +4500,7 @@
         <w:docPartUnique/>
       </w:docPartObj>
     </w:sdtPr>
+    <w:sdtEndPr/>
     <w:sdtContent>
       <w:p>
         <w:pPr>
@@ -3009,7 +5043,7 @@
     <w:lsdException w:name="Table Web 2" w:semiHidden="1" w:unhideWhenUsed="1"/>
     <w:lsdException w:name="Table Web 3" w:semiHidden="1" w:unhideWhenUsed="1"/>
     <w:lsdException w:name="Balloon Text" w:semiHidden="1" w:unhideWhenUsed="1"/>
-    <w:lsdException w:name="Table Grid" w:semiHidden="1" w:uiPriority="39" w:unhideWhenUsed="1"/>
+    <w:lsdException w:name="Table Grid" w:uiPriority="39"/>
     <w:lsdException w:name="Table Theme" w:semiHidden="1" w:unhideWhenUsed="1"/>
     <w:lsdException w:name="Placeholder Text" w:semiHidden="1"/>
     <w:lsdException w:name="No Spacing" w:uiPriority="1" w:qFormat="1"/>

</xml_diff>